<commit_message>
feat: enrichir exercice Sami (10 erreurs, organigramme, icone redondante)
</commit_message>
<xml_diff>
--- a/_source/sami-doc-accessible.docx
+++ b/_source/sami-doc-accessible.docx
@@ -346,6 +346,114 @@
         <w:pStyle w:val="Heading2"/>
       </w:pPr>
       <w:r>
+        <w:t>Organisation du service</w:t>
+      </w:r>
+    </w:p>
+    <w:p>
+      <w:pPr>
+        <w:jc w:val="center"/>
+      </w:pPr>
+      <w:r>
+        <w:drawing>
+          <wp:inline xmlns:a="http://schemas.openxmlformats.org/drawingml/2006/main" xmlns:pic="http://schemas.openxmlformats.org/drawingml/2006/picture">
+            <wp:extent cx="4572000" cy="2689412"/>
+            <wp:docPr id="2" name="Picture 2" descr="Organigramme de la Direction des affaires juridiques (description ci-dessous)." title="Organigramme du service"/>
+            <wp:cNvGraphicFramePr>
+              <a:graphicFrameLocks noChangeAspect="1"/>
+            </wp:cNvGraphicFramePr>
+            <a:graphic>
+              <a:graphicData uri="http://schemas.openxmlformats.org/drawingml/2006/picture">
+                <pic:pic>
+                  <pic:nvPicPr>
+                    <pic:cNvPr id="0" name="organigramme.png"/>
+                    <pic:cNvPicPr/>
+                  </pic:nvPicPr>
+                  <pic:blipFill>
+                    <a:blip r:embed="rId11"/>
+                    <a:stretch>
+                      <a:fillRect/>
+                    </a:stretch>
+                  </pic:blipFill>
+                  <pic:spPr>
+                    <a:xfrm>
+                      <a:off x="0" y="0"/>
+                      <a:ext cx="4572000" cy="2689412"/>
+                    </a:xfrm>
+                    <a:prstGeom prst="rect"/>
+                  </pic:spPr>
+                </pic:pic>
+              </a:graphicData>
+            </a:graphic>
+          </wp:inline>
+        </w:drawing>
+      </w:r>
+    </w:p>
+    <w:p>
+      <w:r>
+        <w:rPr>
+          <w:rFonts w:ascii="Arial" w:hAnsi="Arial"/>
+          <w:sz w:val="20"/>
+        </w:rPr>
+        <w:t>La Direction des affaires juridiques comprend 4 bureaux : le Bureau du droit public, le Bureau du droit social, le Bureau de la communication et le Bureau des affaires internationales. Chaque bureau est rattache directement a la direction.</w:t>
+      </w:r>
+    </w:p>
+    <w:p/>
+    <w:p>
+      <w:pPr>
+        <w:pStyle w:val="Heading2"/>
+      </w:pPr>
+      <w:r>
+        <w:t>Contact</w:t>
+      </w:r>
+    </w:p>
+    <w:p>
+      <w:r>
+        <w:t xml:space="preserve">Pour toute question, contactez-nous par </w:t>
+      </w:r>
+      <w:r>
+        <w:drawing>
+          <wp:inline xmlns:a="http://schemas.openxmlformats.org/drawingml/2006/main" xmlns:pic="http://schemas.openxmlformats.org/drawingml/2006/picture">
+            <wp:extent cx="164592" cy="164592"/>
+            <wp:docPr id="3" name="Picture 3" descr=""/>
+            <wp:cNvGraphicFramePr>
+              <a:graphicFrameLocks noChangeAspect="1"/>
+            </wp:cNvGraphicFramePr>
+            <a:graphic>
+              <a:graphicData uri="http://schemas.openxmlformats.org/drawingml/2006/picture">
+                <pic:pic>
+                  <pic:nvPicPr>
+                    <pic:cNvPr id="0" name="icone-enveloppe.png"/>
+                    <pic:cNvPicPr/>
+                  </pic:nvPicPr>
+                  <pic:blipFill>
+                    <a:blip r:embed="rId12"/>
+                    <a:stretch>
+                      <a:fillRect/>
+                    </a:stretch>
+                  </pic:blipFill>
+                  <pic:spPr>
+                    <a:xfrm>
+                      <a:off x="0" y="0"/>
+                      <a:ext cx="164592" cy="164592"/>
+                    </a:xfrm>
+                    <a:prstGeom prst="rect"/>
+                  </pic:spPr>
+                </pic:pic>
+              </a:graphicData>
+            </a:graphic>
+          </wp:inline>
+        </w:drawing>
+      </w:r>
+      <w:r>
+        <w:t xml:space="preserve"> e-mail pour plus d'informations.</w:t>
+      </w:r>
+    </w:p>
+    <w:p/>
+    <w:p>
+      <w:pPr>
+        <w:pStyle w:val="Heading2"/>
+      </w:pPr>
+      <w:r>
         <w:t>Annexes</w:t>
       </w:r>
     </w:p>

</xml_diff>

<commit_message>
feat: exercice Sami 14 erreurs, fausses listes, retour Sami remplace Sophie
</commit_message>
<xml_diff>
--- a/_source/sami-doc-accessible.docx
+++ b/_source/sami-doc-accessible.docx
@@ -294,6 +294,65 @@
     </w:tbl>
     <w:p/>
     <w:p>
+      <w:r>
+        <w:t>Objectifs du trimestre :</w:t>
+      </w:r>
+    </w:p>
+    <w:p>
+      <w:pPr>
+        <w:pStyle w:val="ListBullet"/>
+      </w:pPr>
+      <w:r>
+        <w:t>Augmenter le trafic de 10 %</w:t>
+      </w:r>
+    </w:p>
+    <w:p>
+      <w:pPr>
+        <w:pStyle w:val="ListBullet"/>
+      </w:pPr>
+      <w:r>
+        <w:t>Publier 3 articles par semaine</w:t>
+      </w:r>
+    </w:p>
+    <w:p>
+      <w:pPr>
+        <w:pStyle w:val="ListBullet"/>
+      </w:pPr>
+      <w:r>
+        <w:t>Réduire le taux de rebond sous 40 %</w:t>
+      </w:r>
+    </w:p>
+    <w:p>
+      <w:r>
+        <w:t>Priorités pour le prochain trimestre :</w:t>
+      </w:r>
+    </w:p>
+    <w:p>
+      <w:pPr>
+        <w:pStyle w:val="ListNumber"/>
+      </w:pPr>
+      <w:r>
+        <w:t>Refonte de la page d'accueil</w:t>
+      </w:r>
+    </w:p>
+    <w:p>
+      <w:pPr>
+        <w:pStyle w:val="ListNumber"/>
+      </w:pPr>
+      <w:r>
+        <w:t>Mise en conformité accessibilité</w:t>
+      </w:r>
+    </w:p>
+    <w:p>
+      <w:pPr>
+        <w:pStyle w:val="ListNumber"/>
+      </w:pPr>
+      <w:r>
+        <w:t>Déploiement de la newsletter</w:t>
+      </w:r>
+    </w:p>
+    <w:p/>
+    <w:p>
       <w:pPr>
         <w:pStyle w:val="Heading3"/>
       </w:pPr>
@@ -446,6 +505,16 @@
       </w:r>
       <w:r>
         <w:t xml:space="preserve"> e-mail pour plus d'informations.</w:t>
+      </w:r>
+    </w:p>
+    <w:p>
+      <w:r>
+        <w:rPr>
+          <w:rFonts w:ascii="Arial" w:hAnsi="Arial"/>
+          <w:sz w:val="22"/>
+          <w:lang w:val="en-US"/>
+        </w:rPr>
+        <w:t>The quarterly report is available upon request. Please contact the communication department for further details.</w:t>
       </w:r>
     </w:p>
     <w:p/>

</xml_diff>

<commit_message>
feat: exercice Sami 18 erreurs (justifie, paragraphes vides, majuscules, filigrane)
</commit_message>
<xml_diff>
--- a/_source/sami-doc-accessible.docx
+++ b/_source/sami-doc-accessible.docx
@@ -2,6 +2,16 @@
 <file path=word/document.xml><?xml version="1.0" encoding="utf-8"?>
 <w:document xmlns:wpc="http://schemas.microsoft.com/office/word/2010/wordprocessingCanvas" xmlns:mo="http://schemas.microsoft.com/office/mac/office/2008/main" xmlns:mc="http://schemas.openxmlformats.org/markup-compatibility/2006" xmlns:mv="urn:schemas-microsoft-com:mac:vml" xmlns:o="urn:schemas-microsoft-com:office:office" xmlns:r="http://schemas.openxmlformats.org/officeDocument/2006/relationships" xmlns:m="http://schemas.openxmlformats.org/officeDocument/2006/math" xmlns:v="urn:schemas-microsoft-com:vml" xmlns:wp14="http://schemas.microsoft.com/office/word/2010/wordprocessingDrawing" xmlns:wp="http://schemas.openxmlformats.org/drawingml/2006/wordprocessingDrawing" xmlns:w10="urn:schemas-microsoft-com:office:word" xmlns:w="http://schemas.openxmlformats.org/wordprocessingml/2006/main" xmlns:w14="http://schemas.microsoft.com/office/word/2010/wordml" xmlns:wpg="http://schemas.microsoft.com/office/word/2010/wordprocessingGroup" xmlns:wpi="http://schemas.microsoft.com/office/word/2010/wordprocessingInk" xmlns:wne="http://schemas.microsoft.com/office/word/2006/wordml" xmlns:wps="http://schemas.microsoft.com/office/word/2010/wordprocessingShape" mc:Ignorable="w14 wp14">
   <w:body>
+    <w:p>
+      <w:r>
+        <w:rPr>
+          <w:rFonts w:ascii="Arial" w:hAnsi="Arial"/>
+          <w:b/>
+          <w:sz w:val="22"/>
+        </w:rPr>
+        <w:t>Document confidentiel</w:t>
+      </w:r>
+    </w:p>
     <w:p>
       <w:pPr>
         <w:pStyle w:val="Heading1"/>
@@ -523,6 +533,9 @@
         <w:pStyle w:val="Heading2"/>
       </w:pPr>
       <w:r>
+        <w:rPr>
+          <w:caps/>
+        </w:rPr>
         <w:t>Annexes</w:t>
       </w:r>
     </w:p>
@@ -933,6 +946,9 @@
     <w:name w:val="Normal"/>
     <w:qFormat/>
     <w:rsid w:val="00FC693F"/>
+    <w:pPr>
+      <w:jc w:val="left"/>
+    </w:pPr>
     <w:rPr>
       <w:rFonts w:ascii="Arial" w:hAnsi="Arial"/>
       <w:sz w:val="22"/>

</xml_diff>

<commit_message>
feat: exercice Sami 21 erreurs (sommaire, texte-image, tableau fusionne)
</commit_message>
<xml_diff>
--- a/_source/sami-doc-accessible.docx
+++ b/_source/sami-doc-accessible.docx
@@ -25,6 +25,36 @@
         <w:t>Ce rapport trimestriel présente les résultats de communication numérique de la Direction des affaires juridiques pour le premier trimestre 2025. Il couvre les principaux indicateurs de performance de nos canaux digitaux.</w:t>
       </w:r>
     </w:p>
+    <w:p>
+      <w:pPr>
+        <w:pStyle w:val="Heading2"/>
+      </w:pPr>
+      <w:r>
+        <w:t>Sommaire</w:t>
+      </w:r>
+    </w:p>
+    <w:p>
+      <w:r>
+        <w:fldChar w:fldCharType="begin"/>
+      </w:r>
+      <w:r>
+        <w:instrText xml:space="preserve"> TOC \o "1-3" \h \z \u </w:instrText>
+      </w:r>
+      <w:r>
+        <w:fldChar w:fldCharType="separate"/>
+      </w:r>
+      <w:r>
+        <w:rPr>
+          <w:color w:val="808080"/>
+          <w:sz w:val="20"/>
+        </w:rPr>
+        <w:t>(Table des matières - mettre à jour avec F9)</w:t>
+      </w:r>
+      <w:r>
+        <w:fldChar w:fldCharType="end"/>
+      </w:r>
+    </w:p>
+    <w:p/>
     <w:p>
       <w:r>
         <w:rPr>
@@ -527,6 +557,175 @@
         <w:t>The quarterly report is available upon request. Please contact the communication department for further details.</w:t>
       </w:r>
     </w:p>
+    <w:p>
+      <w:r>
+        <w:rPr>
+          <w:rFonts w:ascii="Arial" w:hAnsi="Arial"/>
+          <w:b/>
+          <w:sz w:val="22"/>
+        </w:rPr>
+        <w:t>Avis important : les indicateurs du T2 2025 seront transmis avant le 15 septembre 2025.</w:t>
+      </w:r>
+    </w:p>
+    <w:p>
+      <w:pPr>
+        <w:pStyle w:val="Heading3"/>
+      </w:pPr>
+      <w:r>
+        <w:t>Répartition par service</w:t>
+      </w:r>
+    </w:p>
+    <w:tbl>
+      <w:tblPr>
+        <w:tblStyle w:val="TableGrid"/>
+        <w:tblW w:type="auto" w:w="0"/>
+        <w:jc w:val="center"/>
+        <w:tblLook w:firstColumn="1" w:firstRow="1" w:lastColumn="0" w:lastRow="0" w:noHBand="0" w:noVBand="1" w:val="04A0"/>
+      </w:tblPr>
+      <w:tblGrid>
+        <w:gridCol w:w="2880"/>
+        <w:gridCol w:w="2880"/>
+        <w:gridCol w:w="2880"/>
+      </w:tblGrid>
+      <w:tr>
+        <w:trPr>
+          <w:tblHeader val="true"/>
+        </w:trPr>
+        <w:tc>
+          <w:tcPr>
+            <w:tcW w:type="dxa" w:w="2880"/>
+          </w:tcPr>
+          <w:p>
+            <w:r>
+              <w:rPr>
+                <w:rFonts w:ascii="Arial" w:hAnsi="Arial"/>
+                <w:b/>
+                <w:sz w:val="20"/>
+              </w:rPr>
+              <w:t>Service</w:t>
+            </w:r>
+          </w:p>
+        </w:tc>
+        <w:tc>
+          <w:tcPr>
+            <w:tcW w:type="dxa" w:w="2880"/>
+          </w:tcPr>
+          <w:p>
+            <w:r>
+              <w:rPr>
+                <w:rFonts w:ascii="Arial" w:hAnsi="Arial"/>
+                <w:b/>
+                <w:sz w:val="20"/>
+              </w:rPr>
+              <w:t>Effectif</w:t>
+            </w:r>
+          </w:p>
+        </w:tc>
+        <w:tc>
+          <w:tcPr>
+            <w:tcW w:type="dxa" w:w="2880"/>
+          </w:tcPr>
+          <w:p>
+            <w:r>
+              <w:rPr>
+                <w:rFonts w:ascii="Arial" w:hAnsi="Arial"/>
+                <w:b/>
+                <w:sz w:val="20"/>
+              </w:rPr>
+              <w:t>Budget</w:t>
+            </w:r>
+          </w:p>
+        </w:tc>
+      </w:tr>
+      <w:tr>
+        <w:tc>
+          <w:tcPr>
+            <w:tcW w:type="dxa" w:w="2880"/>
+          </w:tcPr>
+          <w:p>
+            <w:r>
+              <w:rPr>
+                <w:rFonts w:ascii="Arial" w:hAnsi="Arial"/>
+                <w:sz w:val="20"/>
+              </w:rPr>
+              <w:t>Communication</w:t>
+            </w:r>
+          </w:p>
+        </w:tc>
+        <w:tc>
+          <w:tcPr>
+            <w:tcW w:type="dxa" w:w="2880"/>
+          </w:tcPr>
+          <w:p>
+            <w:r>
+              <w:rPr>
+                <w:rFonts w:ascii="Arial" w:hAnsi="Arial"/>
+                <w:sz w:val="20"/>
+              </w:rPr>
+              <w:t>12</w:t>
+            </w:r>
+          </w:p>
+        </w:tc>
+        <w:tc>
+          <w:tcPr>
+            <w:tcW w:type="dxa" w:w="2880"/>
+          </w:tcPr>
+          <w:p>
+            <w:r>
+              <w:rPr>
+                <w:rFonts w:ascii="Arial" w:hAnsi="Arial"/>
+                <w:sz w:val="20"/>
+              </w:rPr>
+              <w:t>45 000</w:t>
+            </w:r>
+          </w:p>
+        </w:tc>
+      </w:tr>
+      <w:tr>
+        <w:tc>
+          <w:tcPr>
+            <w:tcW w:type="dxa" w:w="2880"/>
+          </w:tcPr>
+          <w:p>
+            <w:r>
+              <w:rPr>
+                <w:rFonts w:ascii="Arial" w:hAnsi="Arial"/>
+                <w:sz w:val="20"/>
+              </w:rPr>
+              <w:t>Juridique</w:t>
+            </w:r>
+          </w:p>
+        </w:tc>
+        <w:tc>
+          <w:tcPr>
+            <w:tcW w:type="dxa" w:w="2880"/>
+          </w:tcPr>
+          <w:p>
+            <w:r>
+              <w:rPr>
+                <w:rFonts w:ascii="Arial" w:hAnsi="Arial"/>
+                <w:sz w:val="20"/>
+              </w:rPr>
+              <w:t>28</w:t>
+            </w:r>
+          </w:p>
+        </w:tc>
+        <w:tc>
+          <w:tcPr>
+            <w:tcW w:type="dxa" w:w="2880"/>
+          </w:tcPr>
+          <w:p>
+            <w:r>
+              <w:rPr>
+                <w:rFonts w:ascii="Arial" w:hAnsi="Arial"/>
+                <w:sz w:val="20"/>
+              </w:rPr>
+              <w:t>120 000</w:t>
+            </w:r>
+          </w:p>
+        </w:tc>
+      </w:tr>
+    </w:tbl>
     <w:p/>
     <w:p>
       <w:pPr>

</xml_diff>

<commit_message>
Corrige documents Sami et suivi DOCX
</commit_message>
<xml_diff>
--- a/_source/sami-doc-accessible.docx
+++ b/_source/sami-doc-accessible.docx
@@ -6,7 +6,6 @@
       <w:r>
         <w:rPr>
           <w:rFonts w:ascii="Arial" w:hAnsi="Arial"/>
-          <w:b/>
           <w:sz w:val="22"/>
         </w:rPr>
         <w:t>Document confidentiel</w:t>
@@ -54,7 +53,6 @@
         <w:fldChar w:fldCharType="end"/>
       </w:r>
     </w:p>
-    <w:p/>
     <w:p>
       <w:r>
         <w:rPr>
@@ -332,7 +330,6 @@
         </w:tc>
       </w:tr>
     </w:tbl>
-    <w:p/>
     <w:p>
       <w:r>
         <w:t>Objectifs du trimestre :</w:t>
@@ -391,7 +388,6 @@
         <w:t>Déploiement de la newsletter</w:t>
       </w:r>
     </w:p>
-    <w:p/>
     <w:p>
       <w:pPr>
         <w:pStyle w:val="Heading3"/>
@@ -439,7 +435,6 @@
         </w:drawing>
       </w:r>
     </w:p>
-    <w:p/>
     <w:p>
       <w:pPr>
         <w:pStyle w:val="Heading2"/>
@@ -496,7 +491,6 @@
         <w:t>La Direction des affaires juridiques comprend 4 bureaux : le Bureau du droit public, le Bureau du droit social, le Bureau de la communication et le Bureau des affaires internationales. Chaque bureau est rattache directement a la direction.</w:t>
       </w:r>
     </w:p>
-    <w:p/>
     <w:p>
       <w:pPr>
         <w:pStyle w:val="Heading2"/>
@@ -513,7 +507,13 @@
         <w:drawing>
           <wp:inline xmlns:a="http://schemas.openxmlformats.org/drawingml/2006/main" xmlns:pic="http://schemas.openxmlformats.org/drawingml/2006/picture">
             <wp:extent cx="164592" cy="164592"/>
-            <wp:docPr id="3" name="Picture 3" descr=""/>
+            <wp:docPr id="3" name="Picture 3" descr="">
+              <a:extLst>
+                <a:ext uri="{C183D7F6-B498-43B3-948B-1728B52AA6E4}">
+                  <adec:decorative xmlns:adec="http://schemas.microsoft.com/office/drawing/2017/decorative" val="1"/>
+                </a:ext>
+              </a:extLst>
+            </wp:docPr>
             <wp:cNvGraphicFramePr>
               <a:graphicFrameLocks noChangeAspect="1"/>
             </wp:cNvGraphicFramePr>
@@ -561,7 +561,6 @@
       <w:r>
         <w:rPr>
           <w:rFonts w:ascii="Arial" w:hAnsi="Arial"/>
-          <w:b/>
           <w:sz w:val="22"/>
         </w:rPr>
         <w:t>Avis important : les indicateurs du T2 2025 seront transmis avant le 15 septembre 2025.</w:t>
@@ -726,7 +725,6 @@
         </w:tc>
       </w:tr>
     </w:tbl>
-    <w:p/>
     <w:p>
       <w:pPr>
         <w:pStyle w:val="Heading2"/>
@@ -739,13 +737,15 @@
       </w:r>
     </w:p>
     <w:p>
-      <w:r>
-        <w:rPr>
-          <w:color w:val="0000FF"/>
-          <w:u w:val="single"/>
-        </w:rPr>
-        <w:t>Consulter les annexes du rapport T1 2025 (PDF, 1,2 Mo)</w:t>
-      </w:r>
+      <w:hyperlink r:id="rId13">
+        <w:r>
+          <w:rPr>
+            <w:color w:val="0000FF"/>
+            <w:u w:val="single"/>
+          </w:rPr>
+          <w:t>Consulter les annexes du rapport T1 2025 (PDF, 1,2 Mo)</w:t>
+        </w:r>
+      </w:hyperlink>
     </w:p>
     <w:p>
       <w:r>
@@ -993,7 +993,7 @@
         <w:rFonts w:asciiTheme="minorHAnsi" w:eastAsiaTheme="minorEastAsia" w:hAnsiTheme="minorHAnsi" w:cstheme="minorBidi"/>
         <w:sz w:val="22"/>
         <w:szCs w:val="22"/>
-        <w:lang w:val="en-US" w:eastAsia="en-US" w:bidi="ar-SA"/>
+        <w:lang w:val="fr-FR" w:eastAsia="fr-FR" w:bidi="fr-FR"/>
       </w:rPr>
     </w:rPrDefault>
     <w:pPrDefault>

</xml_diff>

<commit_message>
Ameliore exercices Sami et audits accessibilite
</commit_message>
<xml_diff>
--- a/_source/sami-doc-accessible.docx
+++ b/_source/sami-doc-accessible.docx
@@ -416,7 +416,7 @@
                     <pic:cNvPicPr/>
                   </pic:nvPicPr>
                   <pic:blipFill>
-                    <a:blip r:embed="rId10"/>
+                    <a:blip r:embed="rId11"/>
                     <a:stretch>
                       <a:fillRect/>
                     </a:stretch>
@@ -463,7 +463,7 @@
                     <pic:cNvPicPr/>
                   </pic:nvPicPr>
                   <pic:blipFill>
-                    <a:blip r:embed="rId11"/>
+                    <a:blip r:embed="rId12"/>
                     <a:stretch>
                       <a:fillRect/>
                     </a:stretch>
@@ -525,7 +525,7 @@
                     <pic:cNvPicPr/>
                   </pic:nvPicPr>
                   <pic:blipFill>
-                    <a:blip r:embed="rId12"/>
+                    <a:blip r:embed="rId13"/>
                     <a:stretch>
                       <a:fillRect/>
                     </a:stretch>
@@ -737,7 +737,7 @@
       </w:r>
     </w:p>
     <w:p>
-      <w:hyperlink r:id="rId13">
+      <w:hyperlink r:id="rId14">
         <w:r>
           <w:rPr>
             <w:color w:val="0000FF"/>
@@ -759,6 +759,7 @@
     </w:p>
     <w:sectPr>
       <w:headerReference w:type="default" r:id="rId9"/>
+      <w:footerReference w:type="default" r:id="rId10"/>
       <w:pgSz w:w="12240" w:h="15840"/>
       <w:pgMar w:top="1440" w:right="1800" w:bottom="1440" w:left="1800" w:header="720" w:footer="720" w:gutter="0"/>
       <w:cols w:space="720"/>
@@ -768,6 +769,129 @@
 </w:document>
 </file>
 
+<file path=word/footer1.xml><?xml version="1.0" encoding="utf-8"?>
+<w:ftr xmlns:m="http://schemas.openxmlformats.org/officeDocument/2006/math" xmlns:mc="http://schemas.openxmlformats.org/markup-compatibility/2006" xmlns:mo="http://schemas.microsoft.com/office/mac/office/2008/main" xmlns:mv="urn:schemas-microsoft-com:mac:vml" xmlns:o="urn:schemas-microsoft-com:office:office" xmlns:r="http://schemas.openxmlformats.org/officeDocument/2006/relationships" xmlns:v="urn:schemas-microsoft-com:vml" xmlns:w10="urn:schemas-microsoft-com:office:word" xmlns:w14="http://schemas.microsoft.com/office/word/2010/wordml" xmlns:w="http://schemas.openxmlformats.org/wordprocessingml/2006/main" xmlns:wne="http://schemas.microsoft.com/office/word/2006/wordml" xmlns:wp14="http://schemas.microsoft.com/office/word/2010/wordprocessingDrawing" xmlns:wp="http://schemas.openxmlformats.org/drawingml/2006/wordprocessingDrawing" xmlns:wpc="http://schemas.microsoft.com/office/word/2010/wordprocessingCanvas" xmlns:wpg="http://schemas.microsoft.com/office/word/2010/wordprocessingGroup" xmlns:wpi="http://schemas.microsoft.com/office/word/2010/wordprocessingInk" xmlns:wps="http://schemas.microsoft.com/office/word/2010/wordprocessingShape" mc:Ignorable="w14 wp14">
+  <w:p>
+    <w:pPr>
+      <w:pStyle w:val="Footer"/>
+      <w:jc w:val="center"/>
+    </w:pPr>
+    <w:r>
+      <w:rPr>
+        <w:rFonts w:ascii="Arial" w:hAnsi="Arial"/>
+        <w:color w:val="000000"/>
+        <w:sz w:val="18"/>
+      </w:rPr>
+      <w:t>Rapport trimestriel - Bilan T1 2025</w:t>
+    </w:r>
+    <w:r>
+      <w:rPr>
+        <w:rFonts w:ascii="Arial" w:hAnsi="Arial"/>
+        <w:color w:val="000000"/>
+        <w:sz w:val="18"/>
+      </w:rPr>
+      <w:t xml:space="preserve"> - </w:t>
+    </w:r>
+    <w:r>
+      <w:rPr>
+        <w:rFonts w:ascii="Arial" w:hAnsi="Arial"/>
+        <w:color w:val="000000"/>
+        <w:sz w:val="18"/>
+      </w:rPr>
+      <w:t xml:space="preserve">Page </w:t>
+    </w:r>
+    <w:r>
+      <w:rPr>
+        <w:rFonts w:ascii="Arial" w:hAnsi="Arial"/>
+        <w:color w:val="000000"/>
+        <w:sz w:val="18"/>
+      </w:rPr>
+      <w:fldChar w:fldCharType="begin"/>
+    </w:r>
+    <w:r>
+      <w:rPr>
+        <w:rFonts w:ascii="Arial" w:hAnsi="Arial"/>
+        <w:color w:val="000000"/>
+        <w:sz w:val="18"/>
+      </w:rPr>
+      <w:instrText xml:space="preserve"> PAGE </w:instrText>
+    </w:r>
+    <w:r>
+      <w:rPr>
+        <w:rFonts w:ascii="Arial" w:hAnsi="Arial"/>
+        <w:color w:val="000000"/>
+        <w:sz w:val="18"/>
+      </w:rPr>
+      <w:fldChar w:fldCharType="separate"/>
+    </w:r>
+    <w:r>
+      <w:rPr>
+        <w:rFonts w:ascii="Arial" w:hAnsi="Arial"/>
+        <w:color w:val="000000"/>
+        <w:sz w:val="18"/>
+      </w:rPr>
+      <w:t>1</w:t>
+    </w:r>
+    <w:r>
+      <w:rPr>
+        <w:rFonts w:ascii="Arial" w:hAnsi="Arial"/>
+        <w:color w:val="000000"/>
+        <w:sz w:val="18"/>
+      </w:rPr>
+      <w:fldChar w:fldCharType="end"/>
+    </w:r>
+    <w:r>
+      <w:rPr>
+        <w:rFonts w:ascii="Arial" w:hAnsi="Arial"/>
+        <w:color w:val="000000"/>
+        <w:sz w:val="18"/>
+      </w:rPr>
+      <w:t xml:space="preserve"> / </w:t>
+    </w:r>
+    <w:r>
+      <w:rPr>
+        <w:rFonts w:ascii="Arial" w:hAnsi="Arial"/>
+        <w:color w:val="000000"/>
+        <w:sz w:val="18"/>
+      </w:rPr>
+      <w:fldChar w:fldCharType="begin"/>
+    </w:r>
+    <w:r>
+      <w:rPr>
+        <w:rFonts w:ascii="Arial" w:hAnsi="Arial"/>
+        <w:color w:val="000000"/>
+        <w:sz w:val="18"/>
+      </w:rPr>
+      <w:instrText xml:space="preserve"> NUMPAGES </w:instrText>
+    </w:r>
+    <w:r>
+      <w:rPr>
+        <w:rFonts w:ascii="Arial" w:hAnsi="Arial"/>
+        <w:color w:val="000000"/>
+        <w:sz w:val="18"/>
+      </w:rPr>
+      <w:fldChar w:fldCharType="separate"/>
+    </w:r>
+    <w:r>
+      <w:rPr>
+        <w:rFonts w:ascii="Arial" w:hAnsi="Arial"/>
+        <w:color w:val="000000"/>
+        <w:sz w:val="18"/>
+      </w:rPr>
+      <w:t>1</w:t>
+    </w:r>
+    <w:r>
+      <w:rPr>
+        <w:rFonts w:ascii="Arial" w:hAnsi="Arial"/>
+        <w:color w:val="000000"/>
+        <w:sz w:val="18"/>
+      </w:rPr>
+      <w:fldChar w:fldCharType="end"/>
+    </w:r>
+  </w:p>
+</w:ftr>
+</file>
+
 <file path=word/header1.xml><?xml version="1.0" encoding="utf-8"?>
 <w:hdr xmlns:m="http://schemas.openxmlformats.org/officeDocument/2006/math" xmlns:mc="http://schemas.openxmlformats.org/markup-compatibility/2006" xmlns:mo="http://schemas.microsoft.com/office/mac/office/2008/main" xmlns:mv="urn:schemas-microsoft-com:mac:vml" xmlns:o="urn:schemas-microsoft-com:office:office" xmlns:r="http://schemas.openxmlformats.org/officeDocument/2006/relationships" xmlns:v="urn:schemas-microsoft-com:vml" xmlns:w10="urn:schemas-microsoft-com:office:word" xmlns:w14="http://schemas.microsoft.com/office/word/2010/wordml" xmlns:w="http://schemas.openxmlformats.org/wordprocessingml/2006/main" xmlns:wne="http://schemas.microsoft.com/office/word/2006/wordml" xmlns:wp14="http://schemas.microsoft.com/office/word/2010/wordprocessingDrawing" xmlns:wp="http://schemas.openxmlformats.org/drawingml/2006/wordprocessingDrawing" xmlns:wpc="http://schemas.microsoft.com/office/word/2010/wordprocessingCanvas" xmlns:wpg="http://schemas.microsoft.com/office/word/2010/wordprocessingGroup" xmlns:wpi="http://schemas.microsoft.com/office/word/2010/wordprocessingInk" xmlns:wps="http://schemas.microsoft.com/office/word/2010/wordprocessingShape" mc:Ignorable="w14 wp14">
   <w:p>
@@ -776,7 +900,12 @@
       <w:jc w:val="right"/>
     </w:pPr>
     <w:r>
-      <w:t>Direction des affaires juridiques</w:t>
+      <w:rPr>
+        <w:rFonts w:ascii="Arial" w:hAnsi="Arial"/>
+        <w:color w:val="000000"/>
+        <w:sz w:val="18"/>
+      </w:rPr>
+      <w:t>Direction des affaires juridiques - Rapport trimestriel T1 2025</w:t>
     </w:r>
   </w:p>
 </w:hdr>

</xml_diff>